<commit_message>
Replace Energy MDM concept tile with Data & AI governance case study; update CDMP and DCAM dates
Co-Authored-By: Claude Opus 5.5 <noreply@anthropic.com>
Claude-Session: https://claude.ai/code/session_015apdBSHZJyDGgsfXxS59W6
</commit_message>
<xml_diff>
--- a/Calvin_Enobor_Resume.docx
+++ b/Calvin_Enobor_Resume.docx
@@ -1113,7 +1113,7 @@
           <w:sz w:val="24"/>
           <w:szCs w:val="24"/>
         </w:rPr>
-        <w:t>October</w:t>
+        <w:t>November</w:t>
       </w:r>
       <w:r>
         <w:rPr>
@@ -1121,6 +1121,23 @@
           <w:szCs w:val="24"/>
         </w:rPr>
         <w:t xml:space="preserve"> 2026</w:t>
+      </w:r>
+    </w:p>
+    <w:p>
+      <w:pPr>
+        <w:pStyle w:val="ListParagraph"/>
+        <w:numPr>
+          <w:ilvl w:val="0"/>
+          <w:numId w:val="2"/>
+        </w:numPr>
+        <w:spacing w:after="10"/>
+      </w:pPr>
+      <w:r>
+        <w:rPr>
+          <w:sz w:val="24"/>
+          <w:szCs w:val="24"/>
+        </w:rPr>
+        <w:t xml:space="preserve">DCAM, Data Management Capability Assessment Model, EDM Council (in progress) | Expected January 2027</w:t>
       </w:r>
     </w:p>
     <w:p>

</xml_diff>